<commit_message>
User Manual: add components/responsibility table; add request-group attach script for ASIFDOA CPs
https://claude.ai/code/session_018u9Ha6yNhDjJiYvm278fBA
</commit_message>
<xml_diff>
--- a/docs/User_Manual_CR2026020585_Exit_and_Movement_of_Employee.docx
+++ b/docs/User_Manual_CR2026020585_Exit_and_Movement_of_Employee.docx
@@ -987,7 +987,524 @@
         <w:pStyle w:val="Heading2"/>
       </w:pPr>
       <w:r>
-        <w:t>1.2 Before you start</w:t>
+        <w:t>1.2 Components at a glance — responsibilities and navigation</w:t>
+      </w:r>
+    </w:p>
+    <w:tbl>
+      <w:tblPr>
+        <w:tblStyle w:val="TableGrid"/>
+        <w:tblW w:type="auto" w:w="0"/>
+        <w:jc w:val="center"/>
+        <w:tblLook w:firstColumn="1" w:firstRow="1" w:lastColumn="0" w:lastRow="0" w:noHBand="0" w:noVBand="1" w:val="04A0"/>
+      </w:tblPr>
+      <w:tblGrid>
+        <w:gridCol w:w="2160"/>
+        <w:gridCol w:w="2160"/>
+        <w:gridCol w:w="2160"/>
+        <w:gridCol w:w="2160"/>
+      </w:tblGrid>
+      <w:tr>
+        <w:tc>
+          <w:tcPr>
+            <w:tcW w:type="dxa" w:w="3168"/>
+            <w:shd w:val="clear" w:fill="D9D9D9"/>
+          </w:tcPr>
+          <w:p>
+            <w:r>
+              <w:rPr>
+                <w:b/>
+                <w:sz w:val="19"/>
+              </w:rPr>
+              <w:t>Component</w:t>
+            </w:r>
+          </w:p>
+        </w:tc>
+        <w:tc>
+          <w:tcPr>
+            <w:tcW w:type="dxa" w:w="2016"/>
+            <w:shd w:val="clear" w:fill="D9D9D9"/>
+          </w:tcPr>
+          <w:p>
+            <w:r>
+              <w:rPr>
+                <w:b/>
+                <w:sz w:val="19"/>
+              </w:rPr>
+              <w:t>Type</w:t>
+            </w:r>
+          </w:p>
+        </w:tc>
+        <w:tc>
+          <w:tcPr>
+            <w:tcW w:type="dxa" w:w="2304"/>
+            <w:shd w:val="clear" w:fill="D9D9D9"/>
+          </w:tcPr>
+          <w:p>
+            <w:r>
+              <w:rPr>
+                <w:b/>
+                <w:sz w:val="19"/>
+              </w:rPr>
+              <w:t>Responsibility</w:t>
+            </w:r>
+          </w:p>
+        </w:tc>
+        <w:tc>
+          <w:tcPr>
+            <w:tcW w:type="dxa" w:w="2304"/>
+            <w:shd w:val="clear" w:fill="D9D9D9"/>
+          </w:tcPr>
+          <w:p>
+            <w:r>
+              <w:rPr>
+                <w:b/>
+                <w:sz w:val="19"/>
+              </w:rPr>
+              <w:t>Navigation / Access</w:t>
+            </w:r>
+          </w:p>
+        </w:tc>
+      </w:tr>
+      <w:tr>
+        <w:tc>
+          <w:tcPr>
+            <w:tcW w:type="dxa" w:w="3168"/>
+          </w:tcPr>
+          <w:p>
+            <w:r>
+              <w:rPr>
+                <w:sz w:val="19"/>
+              </w:rPr>
+              <w:t>Exit Replacement</w:t>
+            </w:r>
+          </w:p>
+        </w:tc>
+        <w:tc>
+          <w:tcPr>
+            <w:tcW w:type="dxa" w:w="2016"/>
+          </w:tcPr>
+          <w:p>
+            <w:r>
+              <w:rPr>
+                <w:sz w:val="19"/>
+              </w:rPr>
+              <w:t>Form</w:t>
+            </w:r>
+          </w:p>
+        </w:tc>
+        <w:tc>
+          <w:tcPr>
+            <w:tcW w:type="dxa" w:w="2304"/>
+          </w:tcPr>
+          <w:p>
+            <w:r>
+              <w:rPr>
+                <w:sz w:val="19"/>
+              </w:rPr>
+              <w:t>Airtel Africa Manager Responsibility Approvals</w:t>
+            </w:r>
+          </w:p>
+        </w:tc>
+        <w:tc>
+          <w:tcPr>
+            <w:tcW w:type="dxa" w:w="2304"/>
+          </w:tcPr>
+          <w:p>
+            <w:r>
+              <w:rPr>
+                <w:sz w:val="19"/>
+              </w:rPr>
+              <w:t>ASI FDOA Replacement &gt; Exit Replacement</w:t>
+            </w:r>
+          </w:p>
+        </w:tc>
+      </w:tr>
+      <w:tr>
+        <w:tc>
+          <w:tcPr>
+            <w:tcW w:type="dxa" w:w="3168"/>
+          </w:tcPr>
+          <w:p>
+            <w:r>
+              <w:rPr>
+                <w:sz w:val="19"/>
+              </w:rPr>
+              <w:t>Movement Replacement</w:t>
+            </w:r>
+          </w:p>
+        </w:tc>
+        <w:tc>
+          <w:tcPr>
+            <w:tcW w:type="dxa" w:w="2016"/>
+          </w:tcPr>
+          <w:p>
+            <w:r>
+              <w:rPr>
+                <w:sz w:val="19"/>
+              </w:rPr>
+              <w:t>Form</w:t>
+            </w:r>
+          </w:p>
+        </w:tc>
+        <w:tc>
+          <w:tcPr>
+            <w:tcW w:type="dxa" w:w="2304"/>
+          </w:tcPr>
+          <w:p>
+            <w:r>
+              <w:rPr>
+                <w:sz w:val="19"/>
+              </w:rPr>
+              <w:t>Airtel Africa Manager Responsibility Approvals</w:t>
+            </w:r>
+          </w:p>
+        </w:tc>
+        <w:tc>
+          <w:tcPr>
+            <w:tcW w:type="dxa" w:w="2304"/>
+          </w:tcPr>
+          <w:p>
+            <w:r>
+              <w:rPr>
+                <w:sz w:val="19"/>
+              </w:rPr>
+              <w:t>ASI FDOA Replacement &gt; Movement Replacement</w:t>
+            </w:r>
+          </w:p>
+        </w:tc>
+      </w:tr>
+      <w:tr>
+        <w:tc>
+          <w:tcPr>
+            <w:tcW w:type="dxa" w:w="3168"/>
+          </w:tcPr>
+          <w:p>
+            <w:r>
+              <w:rPr>
+                <w:sz w:val="19"/>
+              </w:rPr>
+              <w:t>Superuser Replacement</w:t>
+            </w:r>
+          </w:p>
+        </w:tc>
+        <w:tc>
+          <w:tcPr>
+            <w:tcW w:type="dxa" w:w="2016"/>
+          </w:tcPr>
+          <w:p>
+            <w:r>
+              <w:rPr>
+                <w:sz w:val="19"/>
+              </w:rPr>
+              <w:t>Form</w:t>
+            </w:r>
+          </w:p>
+        </w:tc>
+        <w:tc>
+          <w:tcPr>
+            <w:tcW w:type="dxa" w:w="2304"/>
+          </w:tcPr>
+          <w:p>
+            <w:r>
+              <w:rPr>
+                <w:sz w:val="19"/>
+              </w:rPr>
+              <w:t>ASI Invoice DOA Access</w:t>
+            </w:r>
+          </w:p>
+        </w:tc>
+        <w:tc>
+          <w:tcPr>
+            <w:tcW w:type="dxa" w:w="2304"/>
+          </w:tcPr>
+          <w:p>
+            <w:r>
+              <w:rPr>
+                <w:sz w:val="19"/>
+              </w:rPr>
+              <w:t>ASI FDOA Replacement &gt; Superuser Replacement</w:t>
+            </w:r>
+          </w:p>
+        </w:tc>
+      </w:tr>
+      <w:tr>
+        <w:tc>
+          <w:tcPr>
+            <w:tcW w:type="dxa" w:w="3168"/>
+          </w:tcPr>
+          <w:p>
+            <w:r>
+              <w:rPr>
+                <w:sz w:val="19"/>
+              </w:rPr>
+              <w:t>Airtel FDOA Manager Replacement Report (ASIFDOAMGRRPT)</w:t>
+            </w:r>
+          </w:p>
+        </w:tc>
+        <w:tc>
+          <w:tcPr>
+            <w:tcW w:type="dxa" w:w="2016"/>
+          </w:tcPr>
+          <w:p>
+            <w:r>
+              <w:rPr>
+                <w:sz w:val="19"/>
+              </w:rPr>
+              <w:t>Concurrent Program (report)</w:t>
+            </w:r>
+          </w:p>
+        </w:tc>
+        <w:tc>
+          <w:tcPr>
+            <w:tcW w:type="dxa" w:w="2304"/>
+          </w:tcPr>
+          <w:p>
+            <w:r>
+              <w:rPr>
+                <w:sz w:val="19"/>
+              </w:rPr>
+              <w:t>ASI Invoice DOA Access</w:t>
+            </w:r>
+          </w:p>
+        </w:tc>
+        <w:tc>
+          <w:tcPr>
+            <w:tcW w:type="dxa" w:w="2304"/>
+          </w:tcPr>
+          <w:p>
+            <w:r>
+              <w:rPr>
+                <w:sz w:val="19"/>
+              </w:rPr>
+              <w:t>Requests &gt; Submit a New Request</w:t>
+            </w:r>
+          </w:p>
+        </w:tc>
+      </w:tr>
+      <w:tr>
+        <w:tc>
+          <w:tcPr>
+            <w:tcW w:type="dxa" w:w="3168"/>
+          </w:tcPr>
+          <w:p>
+            <w:r>
+              <w:rPr>
+                <w:sz w:val="19"/>
+              </w:rPr>
+              <w:t>Airtel FDOA Superuser Replacement Report (ASIFDOASURPT)</w:t>
+            </w:r>
+          </w:p>
+        </w:tc>
+        <w:tc>
+          <w:tcPr>
+            <w:tcW w:type="dxa" w:w="2016"/>
+          </w:tcPr>
+          <w:p>
+            <w:r>
+              <w:rPr>
+                <w:sz w:val="19"/>
+              </w:rPr>
+              <w:t>Concurrent Program (report)</w:t>
+            </w:r>
+          </w:p>
+        </w:tc>
+        <w:tc>
+          <w:tcPr>
+            <w:tcW w:type="dxa" w:w="2304"/>
+          </w:tcPr>
+          <w:p>
+            <w:r>
+              <w:rPr>
+                <w:sz w:val="19"/>
+              </w:rPr>
+              <w:t>ASI Invoice DOA Access</w:t>
+            </w:r>
+          </w:p>
+        </w:tc>
+        <w:tc>
+          <w:tcPr>
+            <w:tcW w:type="dxa" w:w="2304"/>
+          </w:tcPr>
+          <w:p>
+            <w:r>
+              <w:rPr>
+                <w:sz w:val="19"/>
+              </w:rPr>
+              <w:t>Requests &gt; Submit a New Request</w:t>
+            </w:r>
+          </w:p>
+        </w:tc>
+      </w:tr>
+      <w:tr>
+        <w:tc>
+          <w:tcPr>
+            <w:tcW w:type="dxa" w:w="3168"/>
+          </w:tcPr>
+          <w:p>
+            <w:r>
+              <w:rPr>
+                <w:sz w:val="19"/>
+              </w:rPr>
+              <w:t>Exit/Movement Notification engine (ASIFDOANOTIF)</w:t>
+            </w:r>
+          </w:p>
+        </w:tc>
+        <w:tc>
+          <w:tcPr>
+            <w:tcW w:type="dxa" w:w="2016"/>
+          </w:tcPr>
+          <w:p>
+            <w:r>
+              <w:rPr>
+                <w:sz w:val="19"/>
+              </w:rPr>
+              <w:t>Concurrent Program (scheduled)</w:t>
+            </w:r>
+          </w:p>
+        </w:tc>
+        <w:tc>
+          <w:tcPr>
+            <w:tcW w:type="dxa" w:w="2304"/>
+          </w:tcPr>
+          <w:p>
+            <w:r>
+              <w:rPr>
+                <w:sz w:val="19"/>
+              </w:rPr>
+              <w:t>Scheduled by IT — no user action</w:t>
+            </w:r>
+          </w:p>
+        </w:tc>
+        <w:tc>
+          <w:tcPr>
+            <w:tcW w:type="dxa" w:w="2304"/>
+          </w:tcPr>
+          <w:p>
+            <w:r>
+              <w:rPr>
+                <w:sz w:val="19"/>
+              </w:rPr>
+              <w:t>Runs daily 12:00</w:t>
+            </w:r>
+          </w:p>
+        </w:tc>
+      </w:tr>
+      <w:tr>
+        <w:tc>
+          <w:tcPr>
+            <w:tcW w:type="dxa" w:w="3168"/>
+          </w:tcPr>
+          <w:p>
+            <w:r>
+              <w:rPr>
+                <w:sz w:val="19"/>
+              </w:rPr>
+              <w:t>PR/PO Requestor Update (ASIFDOAPRPO)</w:t>
+            </w:r>
+          </w:p>
+        </w:tc>
+        <w:tc>
+          <w:tcPr>
+            <w:tcW w:type="dxa" w:w="2016"/>
+          </w:tcPr>
+          <w:p>
+            <w:r>
+              <w:rPr>
+                <w:sz w:val="19"/>
+              </w:rPr>
+              <w:t>Concurrent Program (scheduled)</w:t>
+            </w:r>
+          </w:p>
+        </w:tc>
+        <w:tc>
+          <w:tcPr>
+            <w:tcW w:type="dxa" w:w="2304"/>
+          </w:tcPr>
+          <w:p>
+            <w:r>
+              <w:rPr>
+                <w:sz w:val="19"/>
+              </w:rPr>
+              <w:t>Scheduled by IT — no user action</w:t>
+            </w:r>
+          </w:p>
+        </w:tc>
+        <w:tc>
+          <w:tcPr>
+            <w:tcW w:type="dxa" w:w="2304"/>
+          </w:tcPr>
+          <w:p>
+            <w:r>
+              <w:rPr>
+                <w:sz w:val="19"/>
+              </w:rPr>
+              <w:t>Runs daily 00:30</w:t>
+            </w:r>
+          </w:p>
+        </w:tc>
+      </w:tr>
+      <w:tr>
+        <w:tc>
+          <w:tcPr>
+            <w:tcW w:type="dxa" w:w="3168"/>
+          </w:tcPr>
+          <w:p>
+            <w:r>
+              <w:rPr>
+                <w:sz w:val="19"/>
+              </w:rPr>
+              <w:t>QP Approver Update (ASIFDOAQP)</w:t>
+            </w:r>
+          </w:p>
+        </w:tc>
+        <w:tc>
+          <w:tcPr>
+            <w:tcW w:type="dxa" w:w="2016"/>
+          </w:tcPr>
+          <w:p>
+            <w:r>
+              <w:rPr>
+                <w:sz w:val="19"/>
+              </w:rPr>
+              <w:t>Concurrent Program (scheduled)</w:t>
+            </w:r>
+          </w:p>
+        </w:tc>
+        <w:tc>
+          <w:tcPr>
+            <w:tcW w:type="dxa" w:w="2304"/>
+          </w:tcPr>
+          <w:p>
+            <w:r>
+              <w:rPr>
+                <w:sz w:val="19"/>
+              </w:rPr>
+              <w:t>Scheduled by IT — no user action</w:t>
+            </w:r>
+          </w:p>
+        </w:tc>
+        <w:tc>
+          <w:tcPr>
+            <w:tcW w:type="dxa" w:w="2304"/>
+          </w:tcPr>
+          <w:p>
+            <w:r>
+              <w:rPr>
+                <w:sz w:val="19"/>
+              </w:rPr>
+              <w:t>Runs daily 00:35</w:t>
+            </w:r>
+          </w:p>
+        </w:tc>
+      </w:tr>
+    </w:tbl>
+    <w:p/>
+    <w:p>
+      <w:pPr>
+        <w:pStyle w:val="Heading2"/>
+      </w:pPr>
+      <w:r>
+        <w:t>1.3 Before you start</w:t>
       </w:r>
     </w:p>
     <w:p>

</xml_diff>